<commit_message>
Update latest reconstruction work
</commit_message>
<xml_diff>
--- a/backend/outputs/31032022_Part II_reconstructed_hi.docx
+++ b/backend/outputs/31032022_Part II_reconstructed_hi.docx
@@ -902,7 +902,7 @@
           <w:i/>
           <w:iCs w:val="1"/>
         </w:rPr>
-        <w:t>. . f..</w:t>
+        <w:t>w.e.f.</w:t>
       </w:r>
       <w:r>
         <w:rPr>
@@ -913,24 +913,10 @@
     </w:p>
     <w:p>
       <w:pPr>
-        <w:jc w:val="center"/>
-        <w:rPr>
-          <w:rFonts w:cs="Times New Roman"/>
-        </w:rPr>
-      </w:pPr>
-    </w:p>
-    <w:p>
-      <w:pPr>
-        <w:pStyle w:val="BodyText"/>
-        <w:tabs>
-          <w:tab w:val="left" w:pos="525"/>
-        </w:tabs>
-        <w:spacing w:before="120"/>
-      </w:pPr>
-    </w:p>
-    <w:p>
-      <w:pPr>
-        <w:ind w:right="22" w:firstLine="720"/>
+        <w:keepNext w:val="0"/>
+        <w:keepLines w:val="0"/>
+        <w:pageBreakBefore w:val="0"/>
+        <w:ind/>
         <w:jc w:val="right"/>
         <w:rPr>
           <w:bCs/>
@@ -945,17 +931,8 @@
       <w:r>
         <w:rPr/>
         <w:t>,</w:t>
+        <w:br/>
       </w:r>
-    </w:p>
-    <w:p>
-      <w:pPr>
-        <w:ind w:right="22" w:firstLine="720"/>
-        <w:jc w:val="right"/>
-        <w:rPr>
-          <w:i/>
-          <w:iCs/>
-        </w:rPr>
-      </w:pPr>
       <w:r>
         <w:rPr>
           <w:rFonts w:cs="Nirmala UI" w:eastAsia="Nirmala UI"/>

</xml_diff>